<commit_message>
docs: adaugat schema.png si integrat diagrama in Word
</commit_message>
<xml_diff>
--- a/docs/Rus_Rares_Proiect_BD.docx
+++ b/docs/Rus_Rares_Proiect_BD.docx
@@ -695,6 +695,58 @@
         </w:tc>
       </w:tr>
     </w:tbl>
+    <w:p>
+      <w:pPr>
+        <w:jc w:val="center"/>
+      </w:pPr>
+      <w:r>
+        <w:drawing>
+          <wp:inline xmlns:a="http://schemas.openxmlformats.org/drawingml/2006/main" xmlns:pic="http://schemas.openxmlformats.org/drawingml/2006/picture">
+            <wp:extent cx="5029200" cy="6127050"/>
+            <wp:docPr id="1" name="Picture 1"/>
+            <wp:cNvGraphicFramePr>
+              <a:graphicFrameLocks noChangeAspect="1"/>
+            </wp:cNvGraphicFramePr>
+            <a:graphic>
+              <a:graphicData uri="http://schemas.openxmlformats.org/drawingml/2006/picture">
+                <pic:pic>
+                  <pic:nvPicPr>
+                    <pic:cNvPr id="0" name="schema.png"/>
+                    <pic:cNvPicPr/>
+                  </pic:nvPicPr>
+                  <pic:blipFill>
+                    <a:blip r:embed="rId9"/>
+                    <a:stretch>
+                      <a:fillRect/>
+                    </a:stretch>
+                  </pic:blipFill>
+                  <pic:spPr>
+                    <a:xfrm>
+                      <a:off x="0" y="0"/>
+                      <a:ext cx="5029200" cy="6127050"/>
+                    </a:xfrm>
+                    <a:prstGeom prst="rect"/>
+                  </pic:spPr>
+                </pic:pic>
+              </a:graphicData>
+            </a:graphic>
+          </wp:inline>
+        </w:drawing>
+      </w:r>
+    </w:p>
+    <w:p>
+      <w:pPr>
+        <w:jc w:val="center"/>
+      </w:pPr>
+      <w:r>
+        <w:rPr>
+          <w:rFonts w:ascii="Times New Roman" w:hAnsi="Times New Roman"/>
+          <w:i/>
+          <w:sz w:val="20"/>
+        </w:rPr>
+        <w:t>Figura 1: Diagrama Entitate-Relație (ERD)</w:t>
+      </w:r>
+    </w:p>
     <w:sectPr>
       <w:pgSz w:w="12240" w:h="15840"/>
       <w:pgMar w:top="1411" w:right="1411" w:bottom="1411" w:left="1411" w:header="720" w:footer="720" w:gutter="0"/>

</xml_diff>

<commit_message>
docs: completat dictionarul de date pentru toate cele 6 entitati
</commit_message>
<xml_diff>
--- a/docs/Rus_Rares_Proiect_BD.docx
+++ b/docs/Rus_Rares_Proiect_BD.docx
@@ -747,6 +747,2092 @@
         <w:t>Figura 1: Diagrama Entitate-Relație (ERD)</w:t>
       </w:r>
     </w:p>
+    <w:p>
+      <w:pPr>
+        <w:spacing w:before="200" w:after="80"/>
+      </w:pPr>
+      <w:r>
+        <w:t>Tabelul 2: Structura tabelei users</w:t>
+      </w:r>
+    </w:p>
+    <w:tbl>
+      <w:tblPr>
+        <w:tblW w:type="auto" w:w="0"/>
+        <w:jc w:val="center"/>
+        <w:tblLook w:firstColumn="1" w:firstRow="1" w:lastColumn="0" w:lastRow="0" w:noHBand="0" w:noVBand="1" w:val="04A0"/>
+      </w:tblPr>
+      <w:tblGrid>
+        <w:gridCol w:w="1884"/>
+        <w:gridCol w:w="1884"/>
+        <w:gridCol w:w="1884"/>
+        <w:gridCol w:w="1884"/>
+        <w:gridCol w:w="1884"/>
+      </w:tblGrid>
+      <w:tr>
+        <w:tc>
+          <w:tcPr>
+            <w:tcW w:type="dxa" w:w="1884"/>
+          </w:tcPr>
+          <w:p>
+            <w:r>
+              <w:t>Câmp</w:t>
+            </w:r>
+          </w:p>
+        </w:tc>
+        <w:tc>
+          <w:tcPr>
+            <w:tcW w:type="dxa" w:w="1884"/>
+          </w:tcPr>
+          <w:p>
+            <w:r>
+              <w:t>Tip de date</w:t>
+            </w:r>
+          </w:p>
+        </w:tc>
+        <w:tc>
+          <w:tcPr>
+            <w:tcW w:type="dxa" w:w="1884"/>
+          </w:tcPr>
+          <w:p>
+            <w:r>
+              <w:t>PK/FK</w:t>
+            </w:r>
+          </w:p>
+        </w:tc>
+        <w:tc>
+          <w:tcPr>
+            <w:tcW w:type="dxa" w:w="1884"/>
+          </w:tcPr>
+          <w:p>
+            <w:r>
+              <w:t>Null</w:t>
+            </w:r>
+          </w:p>
+        </w:tc>
+        <w:tc>
+          <w:tcPr>
+            <w:tcW w:type="dxa" w:w="1884"/>
+          </w:tcPr>
+          <w:p>
+            <w:r>
+              <w:t>Descriere</w:t>
+            </w:r>
+          </w:p>
+        </w:tc>
+      </w:tr>
+      <w:tr>
+        <w:tc>
+          <w:tcPr>
+            <w:tcW w:type="dxa" w:w="1884"/>
+          </w:tcPr>
+          <w:p>
+            <w:r>
+              <w:t>id</w:t>
+            </w:r>
+          </w:p>
+        </w:tc>
+        <w:tc>
+          <w:tcPr>
+            <w:tcW w:type="dxa" w:w="1884"/>
+          </w:tcPr>
+          <w:p>
+            <w:r>
+              <w:t>INT / SERIAL</w:t>
+            </w:r>
+          </w:p>
+        </w:tc>
+        <w:tc>
+          <w:tcPr>
+            <w:tcW w:type="dxa" w:w="1884"/>
+          </w:tcPr>
+          <w:p>
+            <w:r>
+              <w:t>PK</w:t>
+            </w:r>
+          </w:p>
+        </w:tc>
+        <w:tc>
+          <w:tcPr>
+            <w:tcW w:type="dxa" w:w="1884"/>
+          </w:tcPr>
+          <w:p>
+            <w:r>
+              <w:t>NOT NULL</w:t>
+            </w:r>
+          </w:p>
+        </w:tc>
+        <w:tc>
+          <w:tcPr>
+            <w:tcW w:type="dxa" w:w="1884"/>
+          </w:tcPr>
+          <w:p>
+            <w:r>
+              <w:t>Identificator unic utilizator</w:t>
+            </w:r>
+          </w:p>
+        </w:tc>
+      </w:tr>
+      <w:tr>
+        <w:tc>
+          <w:tcPr>
+            <w:tcW w:type="dxa" w:w="1884"/>
+          </w:tcPr>
+          <w:p>
+            <w:r>
+              <w:t>email</w:t>
+            </w:r>
+          </w:p>
+        </w:tc>
+        <w:tc>
+          <w:tcPr>
+            <w:tcW w:type="dxa" w:w="1884"/>
+          </w:tcPr>
+          <w:p>
+            <w:r>
+              <w:t>VARCHAR(100)</w:t>
+            </w:r>
+          </w:p>
+        </w:tc>
+        <w:tc>
+          <w:tcPr>
+            <w:tcW w:type="dxa" w:w="1884"/>
+          </w:tcPr>
+          <w:p>
+            <w:r>
+              <w:t>UK</w:t>
+            </w:r>
+          </w:p>
+        </w:tc>
+        <w:tc>
+          <w:tcPr>
+            <w:tcW w:type="dxa" w:w="1884"/>
+          </w:tcPr>
+          <w:p>
+            <w:r>
+              <w:t>NOT NULL</w:t>
+            </w:r>
+          </w:p>
+        </w:tc>
+        <w:tc>
+          <w:tcPr>
+            <w:tcW w:type="dxa" w:w="1884"/>
+          </w:tcPr>
+          <w:p>
+            <w:r>
+              <w:t>Adresa de email unica pentru login</w:t>
+            </w:r>
+          </w:p>
+        </w:tc>
+      </w:tr>
+      <w:tr>
+        <w:tc>
+          <w:tcPr>
+            <w:tcW w:type="dxa" w:w="1884"/>
+          </w:tcPr>
+          <w:p>
+            <w:r>
+              <w:t>first_name</w:t>
+            </w:r>
+          </w:p>
+        </w:tc>
+        <w:tc>
+          <w:tcPr>
+            <w:tcW w:type="dxa" w:w="1884"/>
+          </w:tcPr>
+          <w:p>
+            <w:r>
+              <w:t>VARCHAR(50)</w:t>
+            </w:r>
+          </w:p>
+        </w:tc>
+        <w:tc>
+          <w:tcPr>
+            <w:tcW w:type="dxa" w:w="1884"/>
+          </w:tcPr>
+          <w:p>
+            <w:r>
+              <w:t>-</w:t>
+            </w:r>
+          </w:p>
+        </w:tc>
+        <w:tc>
+          <w:tcPr>
+            <w:tcW w:type="dxa" w:w="1884"/>
+          </w:tcPr>
+          <w:p>
+            <w:r>
+              <w:t>NOT NULL</w:t>
+            </w:r>
+          </w:p>
+        </w:tc>
+        <w:tc>
+          <w:tcPr>
+            <w:tcW w:type="dxa" w:w="1884"/>
+          </w:tcPr>
+          <w:p>
+            <w:r>
+              <w:t>Prenumele titularului</w:t>
+            </w:r>
+          </w:p>
+        </w:tc>
+      </w:tr>
+      <w:tr>
+        <w:tc>
+          <w:tcPr>
+            <w:tcW w:type="dxa" w:w="1884"/>
+          </w:tcPr>
+          <w:p>
+            <w:r>
+              <w:t>last_name</w:t>
+            </w:r>
+          </w:p>
+        </w:tc>
+        <w:tc>
+          <w:tcPr>
+            <w:tcW w:type="dxa" w:w="1884"/>
+          </w:tcPr>
+          <w:p>
+            <w:r>
+              <w:t>VARCHAR(50)</w:t>
+            </w:r>
+          </w:p>
+        </w:tc>
+        <w:tc>
+          <w:tcPr>
+            <w:tcW w:type="dxa" w:w="1884"/>
+          </w:tcPr>
+          <w:p>
+            <w:r>
+              <w:t>-</w:t>
+            </w:r>
+          </w:p>
+        </w:tc>
+        <w:tc>
+          <w:tcPr>
+            <w:tcW w:type="dxa" w:w="1884"/>
+          </w:tcPr>
+          <w:p>
+            <w:r>
+              <w:t>NOT NULL</w:t>
+            </w:r>
+          </w:p>
+        </w:tc>
+        <w:tc>
+          <w:tcPr>
+            <w:tcW w:type="dxa" w:w="1884"/>
+          </w:tcPr>
+          <w:p>
+            <w:r>
+              <w:t>Numele de familie al titularului</w:t>
+            </w:r>
+          </w:p>
+        </w:tc>
+      </w:tr>
+      <w:tr>
+        <w:tc>
+          <w:tcPr>
+            <w:tcW w:type="dxa" w:w="1884"/>
+          </w:tcPr>
+          <w:p>
+            <w:r>
+              <w:t>created_at</w:t>
+            </w:r>
+          </w:p>
+        </w:tc>
+        <w:tc>
+          <w:tcPr>
+            <w:tcW w:type="dxa" w:w="1884"/>
+          </w:tcPr>
+          <w:p>
+            <w:r>
+              <w:t>DATETIME / TIMESTAMP</w:t>
+            </w:r>
+          </w:p>
+        </w:tc>
+        <w:tc>
+          <w:tcPr>
+            <w:tcW w:type="dxa" w:w="1884"/>
+          </w:tcPr>
+          <w:p>
+            <w:r>
+              <w:t>-</w:t>
+            </w:r>
+          </w:p>
+        </w:tc>
+        <w:tc>
+          <w:tcPr>
+            <w:tcW w:type="dxa" w:w="1884"/>
+          </w:tcPr>
+          <w:p>
+            <w:r>
+              <w:t>NOT NULL</w:t>
+            </w:r>
+          </w:p>
+        </w:tc>
+        <w:tc>
+          <w:tcPr>
+            <w:tcW w:type="dxa" w:w="1884"/>
+          </w:tcPr>
+          <w:p>
+            <w:r>
+              <w:t>Data si ora inregistrarii</w:t>
+            </w:r>
+          </w:p>
+        </w:tc>
+      </w:tr>
+    </w:tbl>
+    <w:p>
+      <w:pPr>
+        <w:spacing w:before="200" w:after="80"/>
+      </w:pPr>
+      <w:r>
+        <w:t>Tabelul 3: Structura tabelei categories</w:t>
+      </w:r>
+    </w:p>
+    <w:tbl>
+      <w:tblPr>
+        <w:tblW w:type="auto" w:w="0"/>
+        <w:jc w:val="center"/>
+        <w:tblLook w:firstColumn="1" w:firstRow="1" w:lastColumn="0" w:lastRow="0" w:noHBand="0" w:noVBand="1" w:val="04A0"/>
+      </w:tblPr>
+      <w:tblGrid>
+        <w:gridCol w:w="1884"/>
+        <w:gridCol w:w="1884"/>
+        <w:gridCol w:w="1884"/>
+        <w:gridCol w:w="1884"/>
+        <w:gridCol w:w="1884"/>
+      </w:tblGrid>
+      <w:tr>
+        <w:tc>
+          <w:tcPr>
+            <w:tcW w:type="dxa" w:w="1884"/>
+          </w:tcPr>
+          <w:p>
+            <w:r>
+              <w:t>Câmp</w:t>
+            </w:r>
+          </w:p>
+        </w:tc>
+        <w:tc>
+          <w:tcPr>
+            <w:tcW w:type="dxa" w:w="1884"/>
+          </w:tcPr>
+          <w:p>
+            <w:r>
+              <w:t>Tip de date</w:t>
+            </w:r>
+          </w:p>
+        </w:tc>
+        <w:tc>
+          <w:tcPr>
+            <w:tcW w:type="dxa" w:w="1884"/>
+          </w:tcPr>
+          <w:p>
+            <w:r>
+              <w:t>PK/FK</w:t>
+            </w:r>
+          </w:p>
+        </w:tc>
+        <w:tc>
+          <w:tcPr>
+            <w:tcW w:type="dxa" w:w="1884"/>
+          </w:tcPr>
+          <w:p>
+            <w:r>
+              <w:t>Null</w:t>
+            </w:r>
+          </w:p>
+        </w:tc>
+        <w:tc>
+          <w:tcPr>
+            <w:tcW w:type="dxa" w:w="1884"/>
+          </w:tcPr>
+          <w:p>
+            <w:r>
+              <w:t>Descriere</w:t>
+            </w:r>
+          </w:p>
+        </w:tc>
+      </w:tr>
+      <w:tr>
+        <w:tc>
+          <w:tcPr>
+            <w:tcW w:type="dxa" w:w="1884"/>
+          </w:tcPr>
+          <w:p>
+            <w:r>
+              <w:t>id</w:t>
+            </w:r>
+          </w:p>
+        </w:tc>
+        <w:tc>
+          <w:tcPr>
+            <w:tcW w:type="dxa" w:w="1884"/>
+          </w:tcPr>
+          <w:p>
+            <w:r>
+              <w:t>INT / SERIAL</w:t>
+            </w:r>
+          </w:p>
+        </w:tc>
+        <w:tc>
+          <w:tcPr>
+            <w:tcW w:type="dxa" w:w="1884"/>
+          </w:tcPr>
+          <w:p>
+            <w:r>
+              <w:t>PK</w:t>
+            </w:r>
+          </w:p>
+        </w:tc>
+        <w:tc>
+          <w:tcPr>
+            <w:tcW w:type="dxa" w:w="1884"/>
+          </w:tcPr>
+          <w:p>
+            <w:r>
+              <w:t>NOT NULL</w:t>
+            </w:r>
+          </w:p>
+        </w:tc>
+        <w:tc>
+          <w:tcPr>
+            <w:tcW w:type="dxa" w:w="1884"/>
+          </w:tcPr>
+          <w:p>
+            <w:r>
+              <w:t>Identificator unic categorie</w:t>
+            </w:r>
+          </w:p>
+        </w:tc>
+      </w:tr>
+      <w:tr>
+        <w:tc>
+          <w:tcPr>
+            <w:tcW w:type="dxa" w:w="1884"/>
+          </w:tcPr>
+          <w:p>
+            <w:r>
+              <w:t>name</w:t>
+            </w:r>
+          </w:p>
+        </w:tc>
+        <w:tc>
+          <w:tcPr>
+            <w:tcW w:type="dxa" w:w="1884"/>
+          </w:tcPr>
+          <w:p>
+            <w:r>
+              <w:t>VARCHAR(50)</w:t>
+            </w:r>
+          </w:p>
+        </w:tc>
+        <w:tc>
+          <w:tcPr>
+            <w:tcW w:type="dxa" w:w="1884"/>
+          </w:tcPr>
+          <w:p>
+            <w:r>
+              <w:t>UK</w:t>
+            </w:r>
+          </w:p>
+        </w:tc>
+        <w:tc>
+          <w:tcPr>
+            <w:tcW w:type="dxa" w:w="1884"/>
+          </w:tcPr>
+          <w:p>
+            <w:r>
+              <w:t>NOT NULL</w:t>
+            </w:r>
+          </w:p>
+        </w:tc>
+        <w:tc>
+          <w:tcPr>
+            <w:tcW w:type="dxa" w:w="1884"/>
+          </w:tcPr>
+          <w:p>
+            <w:r>
+              <w:t>Denumire (ex: Utilitati, Salariu, Chirie)</w:t>
+            </w:r>
+          </w:p>
+        </w:tc>
+      </w:tr>
+      <w:tr>
+        <w:tc>
+          <w:tcPr>
+            <w:tcW w:type="dxa" w:w="1884"/>
+          </w:tcPr>
+          <w:p>
+            <w:r>
+              <w:t>is_income</w:t>
+            </w:r>
+          </w:p>
+        </w:tc>
+        <w:tc>
+          <w:tcPr>
+            <w:tcW w:type="dxa" w:w="1884"/>
+          </w:tcPr>
+          <w:p>
+            <w:r>
+              <w:t>BOOLEAN / TINYINT(1)</w:t>
+            </w:r>
+          </w:p>
+        </w:tc>
+        <w:tc>
+          <w:tcPr>
+            <w:tcW w:type="dxa" w:w="1884"/>
+          </w:tcPr>
+          <w:p>
+            <w:r>
+              <w:t>-</w:t>
+            </w:r>
+          </w:p>
+        </w:tc>
+        <w:tc>
+          <w:tcPr>
+            <w:tcW w:type="dxa" w:w="1884"/>
+          </w:tcPr>
+          <w:p>
+            <w:r>
+              <w:t>NOT NULL</w:t>
+            </w:r>
+          </w:p>
+        </w:tc>
+        <w:tc>
+          <w:tcPr>
+            <w:tcW w:type="dxa" w:w="1884"/>
+          </w:tcPr>
+          <w:p>
+            <w:r>
+              <w:t>True = venit, False = cheltuiala</w:t>
+            </w:r>
+          </w:p>
+        </w:tc>
+      </w:tr>
+    </w:tbl>
+    <w:p>
+      <w:pPr>
+        <w:spacing w:before="200" w:after="80"/>
+      </w:pPr>
+      <w:r>
+        <w:t>Tabelul 4: Structura tabelei planned_payments</w:t>
+      </w:r>
+    </w:p>
+    <w:tbl>
+      <w:tblPr>
+        <w:tblW w:type="auto" w:w="0"/>
+        <w:jc w:val="center"/>
+        <w:tblLook w:firstColumn="1" w:firstRow="1" w:lastColumn="0" w:lastRow="0" w:noHBand="0" w:noVBand="1" w:val="04A0"/>
+      </w:tblPr>
+      <w:tblGrid>
+        <w:gridCol w:w="1884"/>
+        <w:gridCol w:w="1884"/>
+        <w:gridCol w:w="1884"/>
+        <w:gridCol w:w="1884"/>
+        <w:gridCol w:w="1884"/>
+      </w:tblGrid>
+      <w:tr>
+        <w:tc>
+          <w:tcPr>
+            <w:tcW w:type="dxa" w:w="1884"/>
+          </w:tcPr>
+          <w:p>
+            <w:r>
+              <w:t>Câmp</w:t>
+            </w:r>
+          </w:p>
+        </w:tc>
+        <w:tc>
+          <w:tcPr>
+            <w:tcW w:type="dxa" w:w="1884"/>
+          </w:tcPr>
+          <w:p>
+            <w:r>
+              <w:t>Tip de date</w:t>
+            </w:r>
+          </w:p>
+        </w:tc>
+        <w:tc>
+          <w:tcPr>
+            <w:tcW w:type="dxa" w:w="1884"/>
+          </w:tcPr>
+          <w:p>
+            <w:r>
+              <w:t>PK/FK</w:t>
+            </w:r>
+          </w:p>
+        </w:tc>
+        <w:tc>
+          <w:tcPr>
+            <w:tcW w:type="dxa" w:w="1884"/>
+          </w:tcPr>
+          <w:p>
+            <w:r>
+              <w:t>Null</w:t>
+            </w:r>
+          </w:p>
+        </w:tc>
+        <w:tc>
+          <w:tcPr>
+            <w:tcW w:type="dxa" w:w="1884"/>
+          </w:tcPr>
+          <w:p>
+            <w:r>
+              <w:t>Descriere</w:t>
+            </w:r>
+          </w:p>
+        </w:tc>
+      </w:tr>
+      <w:tr>
+        <w:tc>
+          <w:tcPr>
+            <w:tcW w:type="dxa" w:w="1884"/>
+          </w:tcPr>
+          <w:p>
+            <w:r>
+              <w:t>id</w:t>
+            </w:r>
+          </w:p>
+        </w:tc>
+        <w:tc>
+          <w:tcPr>
+            <w:tcW w:type="dxa" w:w="1884"/>
+          </w:tcPr>
+          <w:p>
+            <w:r>
+              <w:t>INT / SERIAL</w:t>
+            </w:r>
+          </w:p>
+        </w:tc>
+        <w:tc>
+          <w:tcPr>
+            <w:tcW w:type="dxa" w:w="1884"/>
+          </w:tcPr>
+          <w:p>
+            <w:r>
+              <w:t>PK</w:t>
+            </w:r>
+          </w:p>
+        </w:tc>
+        <w:tc>
+          <w:tcPr>
+            <w:tcW w:type="dxa" w:w="1884"/>
+          </w:tcPr>
+          <w:p>
+            <w:r>
+              <w:t>NOT NULL</w:t>
+            </w:r>
+          </w:p>
+        </w:tc>
+        <w:tc>
+          <w:tcPr>
+            <w:tcW w:type="dxa" w:w="1884"/>
+          </w:tcPr>
+          <w:p>
+            <w:r>
+              <w:t>Identificator unic plata planificata</w:t>
+            </w:r>
+          </w:p>
+        </w:tc>
+      </w:tr>
+      <w:tr>
+        <w:tc>
+          <w:tcPr>
+            <w:tcW w:type="dxa" w:w="1884"/>
+          </w:tcPr>
+          <w:p>
+            <w:r>
+              <w:t>account_id</w:t>
+            </w:r>
+          </w:p>
+        </w:tc>
+        <w:tc>
+          <w:tcPr>
+            <w:tcW w:type="dxa" w:w="1884"/>
+          </w:tcPr>
+          <w:p>
+            <w:r>
+              <w:t>INT</w:t>
+            </w:r>
+          </w:p>
+        </w:tc>
+        <w:tc>
+          <w:tcPr>
+            <w:tcW w:type="dxa" w:w="1884"/>
+          </w:tcPr>
+          <w:p>
+            <w:r>
+              <w:t>FK</w:t>
+            </w:r>
+          </w:p>
+        </w:tc>
+        <w:tc>
+          <w:tcPr>
+            <w:tcW w:type="dxa" w:w="1884"/>
+          </w:tcPr>
+          <w:p>
+            <w:r>
+              <w:t>NOT NULL</w:t>
+            </w:r>
+          </w:p>
+        </w:tc>
+        <w:tc>
+          <w:tcPr>
+            <w:tcW w:type="dxa" w:w="1884"/>
+          </w:tcPr>
+          <w:p>
+            <w:r>
+              <w:t>Contul din care se plateste (accounts.id)</w:t>
+            </w:r>
+          </w:p>
+        </w:tc>
+      </w:tr>
+      <w:tr>
+        <w:tc>
+          <w:tcPr>
+            <w:tcW w:type="dxa" w:w="1884"/>
+          </w:tcPr>
+          <w:p>
+            <w:r>
+              <w:t>category_id</w:t>
+            </w:r>
+          </w:p>
+        </w:tc>
+        <w:tc>
+          <w:tcPr>
+            <w:tcW w:type="dxa" w:w="1884"/>
+          </w:tcPr>
+          <w:p>
+            <w:r>
+              <w:t>INT</w:t>
+            </w:r>
+          </w:p>
+        </w:tc>
+        <w:tc>
+          <w:tcPr>
+            <w:tcW w:type="dxa" w:w="1884"/>
+          </w:tcPr>
+          <w:p>
+            <w:r>
+              <w:t>FK</w:t>
+            </w:r>
+          </w:p>
+        </w:tc>
+        <w:tc>
+          <w:tcPr>
+            <w:tcW w:type="dxa" w:w="1884"/>
+          </w:tcPr>
+          <w:p>
+            <w:r>
+              <w:t>NOT NULL</w:t>
+            </w:r>
+          </w:p>
+        </w:tc>
+        <w:tc>
+          <w:tcPr>
+            <w:tcW w:type="dxa" w:w="1884"/>
+          </w:tcPr>
+          <w:p>
+            <w:r>
+              <w:t>Categoria platii (categories.id)</w:t>
+            </w:r>
+          </w:p>
+        </w:tc>
+      </w:tr>
+      <w:tr>
+        <w:tc>
+          <w:tcPr>
+            <w:tcW w:type="dxa" w:w="1884"/>
+          </w:tcPr>
+          <w:p>
+            <w:r>
+              <w:t>title</w:t>
+            </w:r>
+          </w:p>
+        </w:tc>
+        <w:tc>
+          <w:tcPr>
+            <w:tcW w:type="dxa" w:w="1884"/>
+          </w:tcPr>
+          <w:p>
+            <w:r>
+              <w:t>VARCHAR(150)</w:t>
+            </w:r>
+          </w:p>
+        </w:tc>
+        <w:tc>
+          <w:tcPr>
+            <w:tcW w:type="dxa" w:w="1884"/>
+          </w:tcPr>
+          <w:p>
+            <w:r>
+              <w:t>-</w:t>
+            </w:r>
+          </w:p>
+        </w:tc>
+        <w:tc>
+          <w:tcPr>
+            <w:tcW w:type="dxa" w:w="1884"/>
+          </w:tcPr>
+          <w:p>
+            <w:r>
+              <w:t>NOT NULL</w:t>
+            </w:r>
+          </w:p>
+        </w:tc>
+        <w:tc>
+          <w:tcPr>
+            <w:tcW w:type="dxa" w:w="1884"/>
+          </w:tcPr>
+          <w:p>
+            <w:r>
+              <w:t>Descriere plata (ex: Factura Curent)</w:t>
+            </w:r>
+          </w:p>
+        </w:tc>
+      </w:tr>
+      <w:tr>
+        <w:tc>
+          <w:tcPr>
+            <w:tcW w:type="dxa" w:w="1884"/>
+          </w:tcPr>
+          <w:p>
+            <w:r>
+              <w:t>amount</w:t>
+            </w:r>
+          </w:p>
+        </w:tc>
+        <w:tc>
+          <w:tcPr>
+            <w:tcW w:type="dxa" w:w="1884"/>
+          </w:tcPr>
+          <w:p>
+            <w:r>
+              <w:t>DECIMAL(12,2)</w:t>
+            </w:r>
+          </w:p>
+        </w:tc>
+        <w:tc>
+          <w:tcPr>
+            <w:tcW w:type="dxa" w:w="1884"/>
+          </w:tcPr>
+          <w:p>
+            <w:r>
+              <w:t>-</w:t>
+            </w:r>
+          </w:p>
+        </w:tc>
+        <w:tc>
+          <w:tcPr>
+            <w:tcW w:type="dxa" w:w="1884"/>
+          </w:tcPr>
+          <w:p>
+            <w:r>
+              <w:t>NOT NULL</w:t>
+            </w:r>
+          </w:p>
+        </w:tc>
+        <w:tc>
+          <w:tcPr>
+            <w:tcW w:type="dxa" w:w="1884"/>
+          </w:tcPr>
+          <w:p>
+            <w:r>
+              <w:t>Valoarea obligatiei (&gt; 0.00)</w:t>
+            </w:r>
+          </w:p>
+        </w:tc>
+      </w:tr>
+      <w:tr>
+        <w:tc>
+          <w:tcPr>
+            <w:tcW w:type="dxa" w:w="1884"/>
+          </w:tcPr>
+          <w:p>
+            <w:r>
+              <w:t>target_month</w:t>
+            </w:r>
+          </w:p>
+        </w:tc>
+        <w:tc>
+          <w:tcPr>
+            <w:tcW w:type="dxa" w:w="1884"/>
+          </w:tcPr>
+          <w:p>
+            <w:r>
+              <w:t>DATE</w:t>
+            </w:r>
+          </w:p>
+        </w:tc>
+        <w:tc>
+          <w:tcPr>
+            <w:tcW w:type="dxa" w:w="1884"/>
+          </w:tcPr>
+          <w:p>
+            <w:r>
+              <w:t>-</w:t>
+            </w:r>
+          </w:p>
+        </w:tc>
+        <w:tc>
+          <w:tcPr>
+            <w:tcW w:type="dxa" w:w="1884"/>
+          </w:tcPr>
+          <w:p>
+            <w:r>
+              <w:t>NOT NULL</w:t>
+            </w:r>
+          </w:p>
+        </w:tc>
+        <w:tc>
+          <w:tcPr>
+            <w:tcW w:type="dxa" w:w="1884"/>
+          </w:tcPr>
+          <w:p>
+            <w:r>
+              <w:t>Luna planificata (ex: 2026-10-01)</w:t>
+            </w:r>
+          </w:p>
+        </w:tc>
+      </w:tr>
+      <w:tr>
+        <w:tc>
+          <w:tcPr>
+            <w:tcW w:type="dxa" w:w="1884"/>
+          </w:tcPr>
+          <w:p>
+            <w:r>
+              <w:t>due_date</w:t>
+            </w:r>
+          </w:p>
+        </w:tc>
+        <w:tc>
+          <w:tcPr>
+            <w:tcW w:type="dxa" w:w="1884"/>
+          </w:tcPr>
+          <w:p>
+            <w:r>
+              <w:t>DATE</w:t>
+            </w:r>
+          </w:p>
+        </w:tc>
+        <w:tc>
+          <w:tcPr>
+            <w:tcW w:type="dxa" w:w="1884"/>
+          </w:tcPr>
+          <w:p>
+            <w:r>
+              <w:t>-</w:t>
+            </w:r>
+          </w:p>
+        </w:tc>
+        <w:tc>
+          <w:tcPr>
+            <w:tcW w:type="dxa" w:w="1884"/>
+          </w:tcPr>
+          <w:p>
+            <w:r>
+              <w:t>NULL</w:t>
+            </w:r>
+          </w:p>
+        </w:tc>
+        <w:tc>
+          <w:tcPr>
+            <w:tcW w:type="dxa" w:w="1884"/>
+          </w:tcPr>
+          <w:p>
+            <w:r>
+              <w:t>Data limita scadenta in luna respectiva</w:t>
+            </w:r>
+          </w:p>
+        </w:tc>
+      </w:tr>
+      <w:tr>
+        <w:tc>
+          <w:tcPr>
+            <w:tcW w:type="dxa" w:w="1884"/>
+          </w:tcPr>
+          <w:p>
+            <w:r>
+              <w:t>status</w:t>
+            </w:r>
+          </w:p>
+        </w:tc>
+        <w:tc>
+          <w:tcPr>
+            <w:tcW w:type="dxa" w:w="1884"/>
+          </w:tcPr>
+          <w:p>
+            <w:r>
+              <w:t>VARCHAR(20)</w:t>
+            </w:r>
+          </w:p>
+        </w:tc>
+        <w:tc>
+          <w:tcPr>
+            <w:tcW w:type="dxa" w:w="1884"/>
+          </w:tcPr>
+          <w:p>
+            <w:r>
+              <w:t>-</w:t>
+            </w:r>
+          </w:p>
+        </w:tc>
+        <w:tc>
+          <w:tcPr>
+            <w:tcW w:type="dxa" w:w="1884"/>
+          </w:tcPr>
+          <w:p>
+            <w:r>
+              <w:t>NOT NULL</w:t>
+            </w:r>
+          </w:p>
+        </w:tc>
+        <w:tc>
+          <w:tcPr>
+            <w:tcW w:type="dxa" w:w="1884"/>
+          </w:tcPr>
+          <w:p>
+            <w:r>
+              <w:t>PLANIFICAT, ACHITAT, ANULAT</w:t>
+            </w:r>
+          </w:p>
+        </w:tc>
+      </w:tr>
+      <w:tr>
+        <w:tc>
+          <w:tcPr>
+            <w:tcW w:type="dxa" w:w="1884"/>
+          </w:tcPr>
+          <w:p>
+            <w:r>
+              <w:t>is_recurring</w:t>
+            </w:r>
+          </w:p>
+        </w:tc>
+        <w:tc>
+          <w:tcPr>
+            <w:tcW w:type="dxa" w:w="1884"/>
+          </w:tcPr>
+          <w:p>
+            <w:r>
+              <w:t>BOOLEAN / TINYINT(1)</w:t>
+            </w:r>
+          </w:p>
+        </w:tc>
+        <w:tc>
+          <w:tcPr>
+            <w:tcW w:type="dxa" w:w="1884"/>
+          </w:tcPr>
+          <w:p>
+            <w:r>
+              <w:t>-</w:t>
+            </w:r>
+          </w:p>
+        </w:tc>
+        <w:tc>
+          <w:tcPr>
+            <w:tcW w:type="dxa" w:w="1884"/>
+          </w:tcPr>
+          <w:p>
+            <w:r>
+              <w:t>NOT NULL</w:t>
+            </w:r>
+          </w:p>
+        </w:tc>
+        <w:tc>
+          <w:tcPr>
+            <w:tcW w:type="dxa" w:w="1884"/>
+          </w:tcPr>
+          <w:p>
+            <w:r>
+              <w:t>True = recurenta lunara automata</w:t>
+            </w:r>
+          </w:p>
+        </w:tc>
+      </w:tr>
+      <w:tr>
+        <w:tc>
+          <w:tcPr>
+            <w:tcW w:type="dxa" w:w="1884"/>
+          </w:tcPr>
+          <w:p>
+            <w:r>
+              <w:t>created_at</w:t>
+            </w:r>
+          </w:p>
+        </w:tc>
+        <w:tc>
+          <w:tcPr>
+            <w:tcW w:type="dxa" w:w="1884"/>
+          </w:tcPr>
+          <w:p>
+            <w:r>
+              <w:t>DATETIME / TIMESTAMP</w:t>
+            </w:r>
+          </w:p>
+        </w:tc>
+        <w:tc>
+          <w:tcPr>
+            <w:tcW w:type="dxa" w:w="1884"/>
+          </w:tcPr>
+          <w:p>
+            <w:r>
+              <w:t>-</w:t>
+            </w:r>
+          </w:p>
+        </w:tc>
+        <w:tc>
+          <w:tcPr>
+            <w:tcW w:type="dxa" w:w="1884"/>
+          </w:tcPr>
+          <w:p>
+            <w:r>
+              <w:t>NOT NULL</w:t>
+            </w:r>
+          </w:p>
+        </w:tc>
+        <w:tc>
+          <w:tcPr>
+            <w:tcW w:type="dxa" w:w="1884"/>
+          </w:tcPr>
+          <w:p>
+            <w:r>
+              <w:t>Data inregistrarii platii</w:t>
+            </w:r>
+          </w:p>
+        </w:tc>
+      </w:tr>
+    </w:tbl>
+    <w:p>
+      <w:pPr>
+        <w:spacing w:before="200" w:after="80"/>
+      </w:pPr>
+      <w:r>
+        <w:t>Tabelul 5: Structura tabelei transactions</w:t>
+      </w:r>
+    </w:p>
+    <w:tbl>
+      <w:tblPr>
+        <w:tblW w:type="auto" w:w="0"/>
+        <w:jc w:val="center"/>
+        <w:tblLook w:firstColumn="1" w:firstRow="1" w:lastColumn="0" w:lastRow="0" w:noHBand="0" w:noVBand="1" w:val="04A0"/>
+      </w:tblPr>
+      <w:tblGrid>
+        <w:gridCol w:w="1884"/>
+        <w:gridCol w:w="1884"/>
+        <w:gridCol w:w="1884"/>
+        <w:gridCol w:w="1884"/>
+        <w:gridCol w:w="1884"/>
+      </w:tblGrid>
+      <w:tr>
+        <w:tc>
+          <w:tcPr>
+            <w:tcW w:type="dxa" w:w="1884"/>
+          </w:tcPr>
+          <w:p>
+            <w:r>
+              <w:t>Câmp</w:t>
+            </w:r>
+          </w:p>
+        </w:tc>
+        <w:tc>
+          <w:tcPr>
+            <w:tcW w:type="dxa" w:w="1884"/>
+          </w:tcPr>
+          <w:p>
+            <w:r>
+              <w:t>Tip de date</w:t>
+            </w:r>
+          </w:p>
+        </w:tc>
+        <w:tc>
+          <w:tcPr>
+            <w:tcW w:type="dxa" w:w="1884"/>
+          </w:tcPr>
+          <w:p>
+            <w:r>
+              <w:t>PK/FK</w:t>
+            </w:r>
+          </w:p>
+        </w:tc>
+        <w:tc>
+          <w:tcPr>
+            <w:tcW w:type="dxa" w:w="1884"/>
+          </w:tcPr>
+          <w:p>
+            <w:r>
+              <w:t>Null</w:t>
+            </w:r>
+          </w:p>
+        </w:tc>
+        <w:tc>
+          <w:tcPr>
+            <w:tcW w:type="dxa" w:w="1884"/>
+          </w:tcPr>
+          <w:p>
+            <w:r>
+              <w:t>Descriere</w:t>
+            </w:r>
+          </w:p>
+        </w:tc>
+      </w:tr>
+      <w:tr>
+        <w:tc>
+          <w:tcPr>
+            <w:tcW w:type="dxa" w:w="1884"/>
+          </w:tcPr>
+          <w:p>
+            <w:r>
+              <w:t>id</w:t>
+            </w:r>
+          </w:p>
+        </w:tc>
+        <w:tc>
+          <w:tcPr>
+            <w:tcW w:type="dxa" w:w="1884"/>
+          </w:tcPr>
+          <w:p>
+            <w:r>
+              <w:t>INT / SERIAL</w:t>
+            </w:r>
+          </w:p>
+        </w:tc>
+        <w:tc>
+          <w:tcPr>
+            <w:tcW w:type="dxa" w:w="1884"/>
+          </w:tcPr>
+          <w:p>
+            <w:r>
+              <w:t>PK</w:t>
+            </w:r>
+          </w:p>
+        </w:tc>
+        <w:tc>
+          <w:tcPr>
+            <w:tcW w:type="dxa" w:w="1884"/>
+          </w:tcPr>
+          <w:p>
+            <w:r>
+              <w:t>NOT NULL</w:t>
+            </w:r>
+          </w:p>
+        </w:tc>
+        <w:tc>
+          <w:tcPr>
+            <w:tcW w:type="dxa" w:w="1884"/>
+          </w:tcPr>
+          <w:p>
+            <w:r>
+              <w:t>Identificator unic tranzactie</w:t>
+            </w:r>
+          </w:p>
+        </w:tc>
+      </w:tr>
+      <w:tr>
+        <w:tc>
+          <w:tcPr>
+            <w:tcW w:type="dxa" w:w="1884"/>
+          </w:tcPr>
+          <w:p>
+            <w:r>
+              <w:t>source_account_id</w:t>
+            </w:r>
+          </w:p>
+        </w:tc>
+        <w:tc>
+          <w:tcPr>
+            <w:tcW w:type="dxa" w:w="1884"/>
+          </w:tcPr>
+          <w:p>
+            <w:r>
+              <w:t>INT</w:t>
+            </w:r>
+          </w:p>
+        </w:tc>
+        <w:tc>
+          <w:tcPr>
+            <w:tcW w:type="dxa" w:w="1884"/>
+          </w:tcPr>
+          <w:p>
+            <w:r>
+              <w:t>FK</w:t>
+            </w:r>
+          </w:p>
+        </w:tc>
+        <w:tc>
+          <w:tcPr>
+            <w:tcW w:type="dxa" w:w="1884"/>
+          </w:tcPr>
+          <w:p>
+            <w:r>
+              <w:t>NULL</w:t>
+            </w:r>
+          </w:p>
+        </w:tc>
+        <w:tc>
+          <w:tcPr>
+            <w:tcW w:type="dxa" w:w="1884"/>
+          </w:tcPr>
+          <w:p>
+            <w:r>
+              <w:t>Cont sursa debitat (accounts.id)</w:t>
+            </w:r>
+          </w:p>
+        </w:tc>
+      </w:tr>
+      <w:tr>
+        <w:tc>
+          <w:tcPr>
+            <w:tcW w:type="dxa" w:w="1884"/>
+          </w:tcPr>
+          <w:p>
+            <w:r>
+              <w:t>destination_account_id</w:t>
+            </w:r>
+          </w:p>
+        </w:tc>
+        <w:tc>
+          <w:tcPr>
+            <w:tcW w:type="dxa" w:w="1884"/>
+          </w:tcPr>
+          <w:p>
+            <w:r>
+              <w:t>INT</w:t>
+            </w:r>
+          </w:p>
+        </w:tc>
+        <w:tc>
+          <w:tcPr>
+            <w:tcW w:type="dxa" w:w="1884"/>
+          </w:tcPr>
+          <w:p>
+            <w:r>
+              <w:t>FK</w:t>
+            </w:r>
+          </w:p>
+        </w:tc>
+        <w:tc>
+          <w:tcPr>
+            <w:tcW w:type="dxa" w:w="1884"/>
+          </w:tcPr>
+          <w:p>
+            <w:r>
+              <w:t>NULL</w:t>
+            </w:r>
+          </w:p>
+        </w:tc>
+        <w:tc>
+          <w:tcPr>
+            <w:tcW w:type="dxa" w:w="1884"/>
+          </w:tcPr>
+          <w:p>
+            <w:r>
+              <w:t>Cont destinatie creditat (accounts.id)</w:t>
+            </w:r>
+          </w:p>
+        </w:tc>
+      </w:tr>
+      <w:tr>
+        <w:tc>
+          <w:tcPr>
+            <w:tcW w:type="dxa" w:w="1884"/>
+          </w:tcPr>
+          <w:p>
+            <w:r>
+              <w:t>category_id</w:t>
+            </w:r>
+          </w:p>
+        </w:tc>
+        <w:tc>
+          <w:tcPr>
+            <w:tcW w:type="dxa" w:w="1884"/>
+          </w:tcPr>
+          <w:p>
+            <w:r>
+              <w:t>INT</w:t>
+            </w:r>
+          </w:p>
+        </w:tc>
+        <w:tc>
+          <w:tcPr>
+            <w:tcW w:type="dxa" w:w="1884"/>
+          </w:tcPr>
+          <w:p>
+            <w:r>
+              <w:t>FK</w:t>
+            </w:r>
+          </w:p>
+        </w:tc>
+        <w:tc>
+          <w:tcPr>
+            <w:tcW w:type="dxa" w:w="1884"/>
+          </w:tcPr>
+          <w:p>
+            <w:r>
+              <w:t>NULL</w:t>
+            </w:r>
+          </w:p>
+        </w:tc>
+        <w:tc>
+          <w:tcPr>
+            <w:tcW w:type="dxa" w:w="1884"/>
+          </w:tcPr>
+          <w:p>
+            <w:r>
+              <w:t>Categoria operatiunii (categories.id)</w:t>
+            </w:r>
+          </w:p>
+        </w:tc>
+      </w:tr>
+      <w:tr>
+        <w:tc>
+          <w:tcPr>
+            <w:tcW w:type="dxa" w:w="1884"/>
+          </w:tcPr>
+          <w:p>
+            <w:r>
+              <w:t>planned_payment_id</w:t>
+            </w:r>
+          </w:p>
+        </w:tc>
+        <w:tc>
+          <w:tcPr>
+            <w:tcW w:type="dxa" w:w="1884"/>
+          </w:tcPr>
+          <w:p>
+            <w:r>
+              <w:t>INT</w:t>
+            </w:r>
+          </w:p>
+        </w:tc>
+        <w:tc>
+          <w:tcPr>
+            <w:tcW w:type="dxa" w:w="1884"/>
+          </w:tcPr>
+          <w:p>
+            <w:r>
+              <w:t>FK</w:t>
+            </w:r>
+          </w:p>
+        </w:tc>
+        <w:tc>
+          <w:tcPr>
+            <w:tcW w:type="dxa" w:w="1884"/>
+          </w:tcPr>
+          <w:p>
+            <w:r>
+              <w:t>NULL</w:t>
+            </w:r>
+          </w:p>
+        </w:tc>
+        <w:tc>
+          <w:tcPr>
+            <w:tcW w:type="dxa" w:w="1884"/>
+          </w:tcPr>
+          <w:p>
+            <w:r>
+              <w:t>Legatura cu plata planificata achitata</w:t>
+            </w:r>
+          </w:p>
+        </w:tc>
+      </w:tr>
+      <w:tr>
+        <w:tc>
+          <w:tcPr>
+            <w:tcW w:type="dxa" w:w="1884"/>
+          </w:tcPr>
+          <w:p>
+            <w:r>
+              <w:t>type</w:t>
+            </w:r>
+          </w:p>
+        </w:tc>
+        <w:tc>
+          <w:tcPr>
+            <w:tcW w:type="dxa" w:w="1884"/>
+          </w:tcPr>
+          <w:p>
+            <w:r>
+              <w:t>VARCHAR(30)</w:t>
+            </w:r>
+          </w:p>
+        </w:tc>
+        <w:tc>
+          <w:tcPr>
+            <w:tcW w:type="dxa" w:w="1884"/>
+          </w:tcPr>
+          <w:p>
+            <w:r>
+              <w:t>-</w:t>
+            </w:r>
+          </w:p>
+        </w:tc>
+        <w:tc>
+          <w:tcPr>
+            <w:tcW w:type="dxa" w:w="1884"/>
+          </w:tcPr>
+          <w:p>
+            <w:r>
+              <w:t>NOT NULL</w:t>
+            </w:r>
+          </w:p>
+        </w:tc>
+        <w:tc>
+          <w:tcPr>
+            <w:tcW w:type="dxa" w:w="1884"/>
+          </w:tcPr>
+          <w:p>
+            <w:r>
+              <w:t>VENIT, CHELTUIALA, TRANSFER_ECONOMII</w:t>
+            </w:r>
+          </w:p>
+        </w:tc>
+      </w:tr>
+      <w:tr>
+        <w:tc>
+          <w:tcPr>
+            <w:tcW w:type="dxa" w:w="1884"/>
+          </w:tcPr>
+          <w:p>
+            <w:r>
+              <w:t>amount</w:t>
+            </w:r>
+          </w:p>
+        </w:tc>
+        <w:tc>
+          <w:tcPr>
+            <w:tcW w:type="dxa" w:w="1884"/>
+          </w:tcPr>
+          <w:p>
+            <w:r>
+              <w:t>DECIMAL(12,2)</w:t>
+            </w:r>
+          </w:p>
+        </w:tc>
+        <w:tc>
+          <w:tcPr>
+            <w:tcW w:type="dxa" w:w="1884"/>
+          </w:tcPr>
+          <w:p>
+            <w:r>
+              <w:t>-</w:t>
+            </w:r>
+          </w:p>
+        </w:tc>
+        <w:tc>
+          <w:tcPr>
+            <w:tcW w:type="dxa" w:w="1884"/>
+          </w:tcPr>
+          <w:p>
+            <w:r>
+              <w:t>NOT NULL</w:t>
+            </w:r>
+          </w:p>
+        </w:tc>
+        <w:tc>
+          <w:tcPr>
+            <w:tcW w:type="dxa" w:w="1884"/>
+          </w:tcPr>
+          <w:p>
+            <w:r>
+              <w:t>Suma efectiv tranzactionata (&gt; 0.00)</w:t>
+            </w:r>
+          </w:p>
+        </w:tc>
+      </w:tr>
+      <w:tr>
+        <w:tc>
+          <w:tcPr>
+            <w:tcW w:type="dxa" w:w="1884"/>
+          </w:tcPr>
+          <w:p>
+            <w:r>
+              <w:t>transaction_date</w:t>
+            </w:r>
+          </w:p>
+        </w:tc>
+        <w:tc>
+          <w:tcPr>
+            <w:tcW w:type="dxa" w:w="1884"/>
+          </w:tcPr>
+          <w:p>
+            <w:r>
+              <w:t>DATETIME / TIMESTAMP</w:t>
+            </w:r>
+          </w:p>
+        </w:tc>
+        <w:tc>
+          <w:tcPr>
+            <w:tcW w:type="dxa" w:w="1884"/>
+          </w:tcPr>
+          <w:p>
+            <w:r>
+              <w:t>-</w:t>
+            </w:r>
+          </w:p>
+        </w:tc>
+        <w:tc>
+          <w:tcPr>
+            <w:tcW w:type="dxa" w:w="1884"/>
+          </w:tcPr>
+          <w:p>
+            <w:r>
+              <w:t>NOT NULL</w:t>
+            </w:r>
+          </w:p>
+        </w:tc>
+        <w:tc>
+          <w:tcPr>
+            <w:tcW w:type="dxa" w:w="1884"/>
+          </w:tcPr>
+          <w:p>
+            <w:r>
+              <w:t>Data si ora executiei</w:t>
+            </w:r>
+          </w:p>
+        </w:tc>
+      </w:tr>
+      <w:tr>
+        <w:tc>
+          <w:tcPr>
+            <w:tcW w:type="dxa" w:w="1884"/>
+          </w:tcPr>
+          <w:p>
+            <w:r>
+              <w:t>description</w:t>
+            </w:r>
+          </w:p>
+        </w:tc>
+        <w:tc>
+          <w:tcPr>
+            <w:tcW w:type="dxa" w:w="1884"/>
+          </w:tcPr>
+          <w:p>
+            <w:r>
+              <w:t>TEXT</w:t>
+            </w:r>
+          </w:p>
+        </w:tc>
+        <w:tc>
+          <w:tcPr>
+            <w:tcW w:type="dxa" w:w="1884"/>
+          </w:tcPr>
+          <w:p>
+            <w:r>
+              <w:t>-</w:t>
+            </w:r>
+          </w:p>
+        </w:tc>
+        <w:tc>
+          <w:tcPr>
+            <w:tcW w:type="dxa" w:w="1884"/>
+          </w:tcPr>
+          <w:p>
+            <w:r>
+              <w:t>NULL</w:t>
+            </w:r>
+          </w:p>
+        </w:tc>
+        <w:tc>
+          <w:tcPr>
+            <w:tcW w:type="dxa" w:w="1884"/>
+          </w:tcPr>
+          <w:p>
+            <w:r>
+              <w:t>Detalii optionale despre tranzactie</w:t>
+            </w:r>
+          </w:p>
+        </w:tc>
+      </w:tr>
+    </w:tbl>
+    <w:p>
+      <w:pPr>
+        <w:spacing w:before="200" w:after="80"/>
+      </w:pPr>
+      <w:r>
+        <w:t>Tabelul 6: Structura tabelei savings_goals</w:t>
+      </w:r>
+    </w:p>
+    <w:tbl>
+      <w:tblPr>
+        <w:tblW w:type="auto" w:w="0"/>
+        <w:jc w:val="center"/>
+        <w:tblLook w:firstColumn="1" w:firstRow="1" w:lastColumn="0" w:lastRow="0" w:noHBand="0" w:noVBand="1" w:val="04A0"/>
+      </w:tblPr>
+      <w:tblGrid>
+        <w:gridCol w:w="1884"/>
+        <w:gridCol w:w="1884"/>
+        <w:gridCol w:w="1884"/>
+        <w:gridCol w:w="1884"/>
+        <w:gridCol w:w="1884"/>
+      </w:tblGrid>
+      <w:tr>
+        <w:tc>
+          <w:tcPr>
+            <w:tcW w:type="dxa" w:w="1884"/>
+          </w:tcPr>
+          <w:p>
+            <w:r>
+              <w:t>Câmp</w:t>
+            </w:r>
+          </w:p>
+        </w:tc>
+        <w:tc>
+          <w:tcPr>
+            <w:tcW w:type="dxa" w:w="1884"/>
+          </w:tcPr>
+          <w:p>
+            <w:r>
+              <w:t>Tip de date</w:t>
+            </w:r>
+          </w:p>
+        </w:tc>
+        <w:tc>
+          <w:tcPr>
+            <w:tcW w:type="dxa" w:w="1884"/>
+          </w:tcPr>
+          <w:p>
+            <w:r>
+              <w:t>PK/FK</w:t>
+            </w:r>
+          </w:p>
+        </w:tc>
+        <w:tc>
+          <w:tcPr>
+            <w:tcW w:type="dxa" w:w="1884"/>
+          </w:tcPr>
+          <w:p>
+            <w:r>
+              <w:t>Null</w:t>
+            </w:r>
+          </w:p>
+        </w:tc>
+        <w:tc>
+          <w:tcPr>
+            <w:tcW w:type="dxa" w:w="1884"/>
+          </w:tcPr>
+          <w:p>
+            <w:r>
+              <w:t>Descriere</w:t>
+            </w:r>
+          </w:p>
+        </w:tc>
+      </w:tr>
+      <w:tr>
+        <w:tc>
+          <w:tcPr>
+            <w:tcW w:type="dxa" w:w="1884"/>
+          </w:tcPr>
+          <w:p>
+            <w:r>
+              <w:t>id</w:t>
+            </w:r>
+          </w:p>
+        </w:tc>
+        <w:tc>
+          <w:tcPr>
+            <w:tcW w:type="dxa" w:w="1884"/>
+          </w:tcPr>
+          <w:p>
+            <w:r>
+              <w:t>INT / SERIAL</w:t>
+            </w:r>
+          </w:p>
+        </w:tc>
+        <w:tc>
+          <w:tcPr>
+            <w:tcW w:type="dxa" w:w="1884"/>
+          </w:tcPr>
+          <w:p>
+            <w:r>
+              <w:t>PK</w:t>
+            </w:r>
+          </w:p>
+        </w:tc>
+        <w:tc>
+          <w:tcPr>
+            <w:tcW w:type="dxa" w:w="1884"/>
+          </w:tcPr>
+          <w:p>
+            <w:r>
+              <w:t>NOT NULL</w:t>
+            </w:r>
+          </w:p>
+        </w:tc>
+        <w:tc>
+          <w:tcPr>
+            <w:tcW w:type="dxa" w:w="1884"/>
+          </w:tcPr>
+          <w:p>
+            <w:r>
+              <w:t>Identificator unic obiectiv economii</w:t>
+            </w:r>
+          </w:p>
+        </w:tc>
+      </w:tr>
+      <w:tr>
+        <w:tc>
+          <w:tcPr>
+            <w:tcW w:type="dxa" w:w="1884"/>
+          </w:tcPr>
+          <w:p>
+            <w:r>
+              <w:t>account_id</w:t>
+            </w:r>
+          </w:p>
+        </w:tc>
+        <w:tc>
+          <w:tcPr>
+            <w:tcW w:type="dxa" w:w="1884"/>
+          </w:tcPr>
+          <w:p>
+            <w:r>
+              <w:t>INT</w:t>
+            </w:r>
+          </w:p>
+        </w:tc>
+        <w:tc>
+          <w:tcPr>
+            <w:tcW w:type="dxa" w:w="1884"/>
+          </w:tcPr>
+          <w:p>
+            <w:r>
+              <w:t>FK</w:t>
+            </w:r>
+          </w:p>
+        </w:tc>
+        <w:tc>
+          <w:tcPr>
+            <w:tcW w:type="dxa" w:w="1884"/>
+          </w:tcPr>
+          <w:p>
+            <w:r>
+              <w:t>NOT NULL</w:t>
+            </w:r>
+          </w:p>
+        </w:tc>
+        <w:tc>
+          <w:tcPr>
+            <w:tcW w:type="dxa" w:w="1884"/>
+          </w:tcPr>
+          <w:p>
+            <w:r>
+              <w:t>Contul de economii asociat (accounts.id)</w:t>
+            </w:r>
+          </w:p>
+        </w:tc>
+      </w:tr>
+      <w:tr>
+        <w:tc>
+          <w:tcPr>
+            <w:tcW w:type="dxa" w:w="1884"/>
+          </w:tcPr>
+          <w:p>
+            <w:r>
+              <w:t>title</w:t>
+            </w:r>
+          </w:p>
+        </w:tc>
+        <w:tc>
+          <w:tcPr>
+            <w:tcW w:type="dxa" w:w="1884"/>
+          </w:tcPr>
+          <w:p>
+            <w:r>
+              <w:t>VARCHAR(100)</w:t>
+            </w:r>
+          </w:p>
+        </w:tc>
+        <w:tc>
+          <w:tcPr>
+            <w:tcW w:type="dxa" w:w="1884"/>
+          </w:tcPr>
+          <w:p>
+            <w:r>
+              <w:t>-</w:t>
+            </w:r>
+          </w:p>
+        </w:tc>
+        <w:tc>
+          <w:tcPr>
+            <w:tcW w:type="dxa" w:w="1884"/>
+          </w:tcPr>
+          <w:p>
+            <w:r>
+              <w:t>NOT NULL</w:t>
+            </w:r>
+          </w:p>
+        </w:tc>
+        <w:tc>
+          <w:tcPr>
+            <w:tcW w:type="dxa" w:w="1884"/>
+          </w:tcPr>
+          <w:p>
+            <w:r>
+              <w:t>Nume obiectiv (ex: Fond Urgenta)</w:t>
+            </w:r>
+          </w:p>
+        </w:tc>
+      </w:tr>
+      <w:tr>
+        <w:tc>
+          <w:tcPr>
+            <w:tcW w:type="dxa" w:w="1884"/>
+          </w:tcPr>
+          <w:p>
+            <w:r>
+              <w:t>target_amount</w:t>
+            </w:r>
+          </w:p>
+        </w:tc>
+        <w:tc>
+          <w:tcPr>
+            <w:tcW w:type="dxa" w:w="1884"/>
+          </w:tcPr>
+          <w:p>
+            <w:r>
+              <w:t>DECIMAL(12,2)</w:t>
+            </w:r>
+          </w:p>
+        </w:tc>
+        <w:tc>
+          <w:tcPr>
+            <w:tcW w:type="dxa" w:w="1884"/>
+          </w:tcPr>
+          <w:p>
+            <w:r>
+              <w:t>-</w:t>
+            </w:r>
+          </w:p>
+        </w:tc>
+        <w:tc>
+          <w:tcPr>
+            <w:tcW w:type="dxa" w:w="1884"/>
+          </w:tcPr>
+          <w:p>
+            <w:r>
+              <w:t>NOT NULL</w:t>
+            </w:r>
+          </w:p>
+        </w:tc>
+        <w:tc>
+          <w:tcPr>
+            <w:tcW w:type="dxa" w:w="1884"/>
+          </w:tcPr>
+          <w:p>
+            <w:r>
+              <w:t>Suma totala vizata (&gt; 0.00)</w:t>
+            </w:r>
+          </w:p>
+        </w:tc>
+      </w:tr>
+      <w:tr>
+        <w:tc>
+          <w:tcPr>
+            <w:tcW w:type="dxa" w:w="1884"/>
+          </w:tcPr>
+          <w:p>
+            <w:r>
+              <w:t>current_amount</w:t>
+            </w:r>
+          </w:p>
+        </w:tc>
+        <w:tc>
+          <w:tcPr>
+            <w:tcW w:type="dxa" w:w="1884"/>
+          </w:tcPr>
+          <w:p>
+            <w:r>
+              <w:t>DECIMAL(12,2)</w:t>
+            </w:r>
+          </w:p>
+        </w:tc>
+        <w:tc>
+          <w:tcPr>
+            <w:tcW w:type="dxa" w:w="1884"/>
+          </w:tcPr>
+          <w:p>
+            <w:r>
+              <w:t>-</w:t>
+            </w:r>
+          </w:p>
+        </w:tc>
+        <w:tc>
+          <w:tcPr>
+            <w:tcW w:type="dxa" w:w="1884"/>
+          </w:tcPr>
+          <w:p>
+            <w:r>
+              <w:t>NOT NULL</w:t>
+            </w:r>
+          </w:p>
+        </w:tc>
+        <w:tc>
+          <w:tcPr>
+            <w:tcW w:type="dxa" w:w="1884"/>
+          </w:tcPr>
+          <w:p>
+            <w:r>
+              <w:t>Suma acumulata pana in prezent</w:t>
+            </w:r>
+          </w:p>
+        </w:tc>
+      </w:tr>
+      <w:tr>
+        <w:tc>
+          <w:tcPr>
+            <w:tcW w:type="dxa" w:w="1884"/>
+          </w:tcPr>
+          <w:p>
+            <w:r>
+              <w:t>deadline</w:t>
+            </w:r>
+          </w:p>
+        </w:tc>
+        <w:tc>
+          <w:tcPr>
+            <w:tcW w:type="dxa" w:w="1884"/>
+          </w:tcPr>
+          <w:p>
+            <w:r>
+              <w:t>DATE</w:t>
+            </w:r>
+          </w:p>
+        </w:tc>
+        <w:tc>
+          <w:tcPr>
+            <w:tcW w:type="dxa" w:w="1884"/>
+          </w:tcPr>
+          <w:p>
+            <w:r>
+              <w:t>-</w:t>
+            </w:r>
+          </w:p>
+        </w:tc>
+        <w:tc>
+          <w:tcPr>
+            <w:tcW w:type="dxa" w:w="1884"/>
+          </w:tcPr>
+          <w:p>
+            <w:r>
+              <w:t>NULL</w:t>
+            </w:r>
+          </w:p>
+        </w:tc>
+        <w:tc>
+          <w:tcPr>
+            <w:tcW w:type="dxa" w:w="1884"/>
+          </w:tcPr>
+          <w:p>
+            <w:r>
+              <w:t>Data tinta estimata pentru atingere</w:t>
+            </w:r>
+          </w:p>
+        </w:tc>
+      </w:tr>
+    </w:tbl>
     <w:sectPr>
       <w:pgSz w:w="12240" w:h="15840"/>
       <w:pgMar w:top="1411" w:right="1411" w:bottom="1411" w:left="1411" w:header="720" w:footer="720" w:gutter="0"/>

</xml_diff>